<commit_message>
Added gateway using litellm
</commit_message>
<xml_diff>
--- a/Procurement_RAG_Architecture.docx
+++ b/Procurement_RAG_Architecture.docx
@@ -22,16 +22,12 @@
         <w:spacing w:after="240"/>
       </w:pPr>
       <w:r>
-        <w:rPr>
-          <w:color w:val="535E6F"/>
-          <w:sz w:val="24"/>
-        </w:rPr>
-        <w:t>Agentic retrieval, MongoDB Atlas Vector Search, MySQL lookup tools, Gemini LLM, and LangGraph memory</w:t>
+        <w:t>Agentic retrieval, MongoDB Atlas Vector Search, MySQL lookup tools, LiteLLM gateway, and LangGraph memory</w:t>
       </w:r>
     </w:p>
     <w:p>
       <w:r>
-        <w:t>This document updates the original RAG architecture to match the current implementation in the project. The bot is now an agentic procurement assistant with three domain tools: Supplier Contract retrieval from MongoDB Atlas, Purchase Order lookup from MySQL, and Invoice lookup from MySQL. LangGraph orchestrates the LLM/tool loop and stores per-thread memory through a checkpointer.</w:t>
+        <w:t>This document reflects the current procurement assistant implementation. It combines supplier-document RAG, MySQL lookup tools, LangGraph memory, LangSmith tracing, and a LiteLLM gateway that classifies requests, caches local responses, selects low-latency model deployments, and fails over when a deployment is unavailable.</w:t>
       </w:r>
     </w:p>
     <w:p>
@@ -41,7 +37,7 @@
       <w:r>
         <w:drawing>
           <wp:inline xmlns:a="http://schemas.openxmlformats.org/drawingml/2006/main" xmlns:pic="http://schemas.openxmlformats.org/drawingml/2006/picture">
-            <wp:extent cx="6126480" cy="3752469"/>
+            <wp:extent cx="6217920" cy="3627120"/>
             <wp:docPr id="1" name="Picture 1"/>
             <wp:cNvGraphicFramePr>
               <a:graphicFrameLocks noChangeAspect="1"/>
@@ -50,11 +46,11 @@
               <a:graphicData uri="http://schemas.openxmlformats.org/drawingml/2006/picture">
                 <pic:pic>
                   <pic:nvPicPr>
-                    <pic:cNvPr id="0" name="procurement_architecture_updated.png"/>
+                    <pic:cNvPr id="0" name="litellm_gateway_architecture.png"/>
                     <pic:cNvPicPr/>
                   </pic:nvPicPr>
                   <pic:blipFill>
-                    <a:blip r:embed="rId11"/>
+                    <a:blip r:embed="rId14"/>
                     <a:stretch>
                       <a:fillRect/>
                     </a:stretch>
@@ -62,7 +58,7 @@
                   <pic:spPr>
                     <a:xfrm>
                       <a:off x="0" y="0"/>
-                      <a:ext cx="6126480" cy="3752469"/>
+                      <a:ext cx="6217920" cy="3627120"/>
                     </a:xfrm>
                     <a:prstGeom prst="rect"/>
                   </pic:spPr>
@@ -78,12 +74,7 @@
         <w:jc w:val="center"/>
       </w:pPr>
       <w:r>
-        <w:rPr>
-          <w:i/>
-          <w:color w:val="535E6F"/>
-          <w:sz w:val="18"/>
-        </w:rPr>
-        <w:t>Figure 1. Current end-to-end architecture with ingestion, agent routing, tools, backends, and memory.</w:t>
+        <w:t>Figure 1. Current architecture with data ingestion, LiteLLM task routing, procurement tools, data backends, and thread memory.</w:t>
       </w:r>
     </w:p>
     <w:p>
@@ -96,7 +87,7 @@
     </w:p>
     <w:p>
       <w:r>
-        <w:t>The project implements a procurement RAG and data lookup assistant. Static supplier documents are ingested from local PDF and Excel files, chunked, embedded with Hugging Face models, and stored in MongoDB Atlas for semantic vector search. Runtime questions are handled by a Gemini chat model inside a LangGraph StateGraph. The LLM can answer directly or call one of three tools depending on the user request.</w:t>
+        <w:t>The project implements a procurement RAG and data lookup assistant. Static supplier documents are ingested from local PDF and Excel files, chunked, embedded with Hugging Face models, and stored in MongoDB Atlas for semantic vector search. Runtime questions are handled inside a LangGraph StateGraph. Gemini classifies each new request as general, code, or RAG, then a LiteLLM Router selects a healthy deployment in that model group. The selected model can answer directly or call a procurement tool.</w:t>
       </w:r>
     </w:p>
     <w:p>
@@ -166,16 +157,12 @@
             </w:tcMar>
           </w:tcPr>
           <w:p>
-            <w:r/>
             <w:r>
               <w:rPr>
-                <w:b/>
-                <w:color w:val="0B2545"/>
+                <w:rFonts w:ascii="Arial" w:hAnsi="Arial"/>
+                <w:sz w:val="18"/>
               </w:rPr>
-              <w:t xml:space="preserve">Architecture readout: </w:t>
-            </w:r>
-            <w:r>
-              <w:t>The project has evolved from a single-tool RAG workflow into a small procurement agent. The main design strength is domain routing; the main production risk is that memory and SQL execution guardrails are still development-grade.</w:t>
+              <w:t>Architecture readout: The procurement agent now uses a LiteLLM gateway in front of LangGraph. Gemini classifies new questions, the router chooses the lowest-latency healthy model deployment, and local caching plus failover improve reliability without changing the domain tool loop.</w:t>
             </w:r>
           </w:p>
         </w:tc>
@@ -226,14 +213,10 @@
             <w:shd w:fill="E8EEF5"/>
           </w:tcPr>
           <w:p>
-            <w:pPr>
-              <w:spacing w:after="40"/>
-            </w:pPr>
             <w:r>
               <w:rPr>
-                <w:b/>
-                <w:color w:val="0B2545"/>
-                <w:sz w:val="19"/>
+                <w:rFonts w:ascii="Arial" w:hAnsi="Arial"/>
+                <w:sz w:val="18"/>
               </w:rPr>
               <w:t>Component</w:t>
             </w:r>
@@ -258,14 +241,10 @@
             <w:shd w:fill="E8EEF5"/>
           </w:tcPr>
           <w:p>
-            <w:pPr>
-              <w:spacing w:after="40"/>
-            </w:pPr>
             <w:r>
               <w:rPr>
-                <w:b/>
-                <w:color w:val="0B2545"/>
-                <w:sz w:val="19"/>
+                <w:rFonts w:ascii="Arial" w:hAnsi="Arial"/>
+                <w:sz w:val="18"/>
               </w:rPr>
               <w:t>File</w:t>
             </w:r>
@@ -290,14 +269,10 @@
             <w:shd w:fill="E8EEF5"/>
           </w:tcPr>
           <w:p>
-            <w:pPr>
-              <w:spacing w:after="40"/>
-            </w:pPr>
             <w:r>
               <w:rPr>
-                <w:b/>
-                <w:color w:val="0B2545"/>
-                <w:sz w:val="19"/>
+                <w:rFonts w:ascii="Arial" w:hAnsi="Arial"/>
+                <w:sz w:val="18"/>
               </w:rPr>
               <w:t>Responsibility</w:t>
             </w:r>
@@ -323,14 +298,12 @@
             </w:tcMar>
           </w:tcPr>
           <w:p>
-            <w:pPr>
-              <w:spacing w:after="40"/>
-            </w:pPr>
             <w:r>
               <w:rPr>
-                <w:sz w:val="19"/>
+                <w:rFonts w:ascii="Arial" w:hAnsi="Arial"/>
+                <w:sz w:val="18"/>
               </w:rPr>
-              <w:t>Settings</w:t>
+              <w:t>Settings and tracing</w:t>
             </w:r>
           </w:p>
         </w:tc>
@@ -352,14 +325,12 @@
             </w:tcMar>
           </w:tcPr>
           <w:p>
-            <w:pPr>
-              <w:spacing w:after="40"/>
-            </w:pPr>
             <w:r>
               <w:rPr>
-                <w:sz w:val="19"/>
+                <w:rFonts w:ascii="Arial" w:hAnsi="Arial"/>
+                <w:sz w:val="18"/>
               </w:rPr>
-              <w:t>code/config.py</w:t>
+              <w:t>scr_code/config.py</w:t>
             </w:r>
           </w:p>
         </w:tc>
@@ -381,14 +352,12 @@
             </w:tcMar>
           </w:tcPr>
           <w:p>
-            <w:pPr>
-              <w:spacing w:after="40"/>
-            </w:pPr>
             <w:r>
               <w:rPr>
-                <w:sz w:val="19"/>
+                <w:rFonts w:ascii="Arial" w:hAnsi="Arial"/>
+                <w:sz w:val="18"/>
               </w:rPr>
-              <w:t>Reads MongoDB, vector index, embedding, data directory, chunking, and MySQL configuration from environment variables.</w:t>
+              <w:t>Reads MongoDB, vector index, embedding, MySQL, and LangSmith configuration from environment variables.</w:t>
             </w:r>
           </w:p>
         </w:tc>
@@ -412,12 +381,10 @@
             </w:tcMar>
           </w:tcPr>
           <w:p>
-            <w:pPr>
-              <w:spacing w:after="40"/>
-            </w:pPr>
             <w:r>
               <w:rPr>
-                <w:sz w:val="19"/>
+                <w:rFonts w:ascii="Arial" w:hAnsi="Arial"/>
+                <w:sz w:val="18"/>
               </w:rPr>
               <w:t>Ingestion pipeline</w:t>
             </w:r>
@@ -441,14 +408,12 @@
             </w:tcMar>
           </w:tcPr>
           <w:p>
-            <w:pPr>
-              <w:spacing w:after="40"/>
-            </w:pPr>
             <w:r>
               <w:rPr>
-                <w:sz w:val="19"/>
+                <w:rFonts w:ascii="Arial" w:hAnsi="Arial"/>
+                <w:sz w:val="18"/>
               </w:rPr>
-              <w:t>code/ingest.py</w:t>
+              <w:t>scr_code/ingest.py</w:t>
             </w:r>
           </w:p>
         </w:tc>
@@ -470,14 +435,12 @@
             </w:tcMar>
           </w:tcPr>
           <w:p>
-            <w:pPr>
-              <w:spacing w:after="40"/>
-            </w:pPr>
             <w:r>
               <w:rPr>
-                <w:sz w:val="19"/>
+                <w:rFonts w:ascii="Arial" w:hAnsi="Arial"/>
+                <w:sz w:val="18"/>
               </w:rPr>
-              <w:t>Loads PDF/Excel sources, chunks text, embeds chunks, upserts MongoDB records, and creates the Atlas vector index.</w:t>
+              <w:t>Loads PDF and Excel sources, chunks text, embeds chunks, upserts MongoDB records, and creates the Atlas vector index.</w:t>
             </w:r>
           </w:p>
         </w:tc>
@@ -501,12 +464,10 @@
             </w:tcMar>
           </w:tcPr>
           <w:p>
-            <w:pPr>
-              <w:spacing w:after="40"/>
-            </w:pPr>
             <w:r>
               <w:rPr>
-                <w:sz w:val="19"/>
+                <w:rFonts w:ascii="Arial" w:hAnsi="Arial"/>
+                <w:sz w:val="18"/>
               </w:rPr>
               <w:t>Vector retrieval</w:t>
             </w:r>
@@ -530,14 +491,12 @@
             </w:tcMar>
           </w:tcPr>
           <w:p>
-            <w:pPr>
-              <w:spacing w:after="40"/>
-            </w:pPr>
             <w:r>
               <w:rPr>
-                <w:sz w:val="19"/>
+                <w:rFonts w:ascii="Arial" w:hAnsi="Arial"/>
+                <w:sz w:val="18"/>
               </w:rPr>
-              <w:t>code/retrieve.py</w:t>
+              <w:t>scr_code/retrieve.py</w:t>
             </w:r>
           </w:p>
         </w:tc>
@@ -559,12 +518,10 @@
             </w:tcMar>
           </w:tcPr>
           <w:p>
-            <w:pPr>
-              <w:spacing w:after="40"/>
-            </w:pPr>
             <w:r>
               <w:rPr>
-                <w:sz w:val="19"/>
+                <w:rFonts w:ascii="Arial" w:hAnsi="Arial"/>
+                <w:sz w:val="18"/>
               </w:rPr>
               <w:t>Embeds the user query and runs MongoDB Atlas $vectorSearch against stored chunk vectors.</w:t>
             </w:r>
@@ -590,14 +547,12 @@
             </w:tcMar>
           </w:tcPr>
           <w:p>
-            <w:pPr>
-              <w:spacing w:after="40"/>
-            </w:pPr>
             <w:r>
               <w:rPr>
-                <w:sz w:val="19"/>
+                <w:rFonts w:ascii="Arial" w:hAnsi="Arial"/>
+                <w:sz w:val="18"/>
               </w:rPr>
-              <w:t>Google LLM</w:t>
+              <w:t>LiteLLM gateway</w:t>
             </w:r>
           </w:p>
         </w:tc>
@@ -619,14 +574,12 @@
             </w:tcMar>
           </w:tcPr>
           <w:p>
-            <w:pPr>
-              <w:spacing w:after="40"/>
-            </w:pPr>
             <w:r>
               <w:rPr>
-                <w:sz w:val="19"/>
+                <w:rFonts w:ascii="Arial" w:hAnsi="Arial"/>
+                <w:sz w:val="18"/>
               </w:rPr>
-              <w:t>code/google_llm.py</w:t>
+              <w:t>scr_code/llm_gateway.py</w:t>
             </w:r>
           </w:p>
         </w:tc>
@@ -648,14 +601,12 @@
             </w:tcMar>
           </w:tcPr>
           <w:p>
-            <w:pPr>
-              <w:spacing w:after="40"/>
-            </w:pPr>
             <w:r>
               <w:rPr>
-                <w:sz w:val="19"/>
+                <w:rFonts w:ascii="Arial" w:hAnsi="Arial"/>
+                <w:sz w:val="18"/>
               </w:rPr>
-              <w:t>Initializes ChatGoogleGenerativeAI with GOOGLE_API_KEY, GOOGLE_MODEL, and controlled temperature.</w:t>
+              <w:t>Defines model groups, local caching, latency routing, deployment failover, task classification, and provider-independent response text handling.</w:t>
             </w:r>
           </w:p>
         </w:tc>
@@ -679,12 +630,10 @@
             </w:tcMar>
           </w:tcPr>
           <w:p>
-            <w:pPr>
-              <w:spacing w:after="40"/>
-            </w:pPr>
             <w:r>
               <w:rPr>
-                <w:sz w:val="19"/>
+                <w:rFonts w:ascii="Arial" w:hAnsi="Arial"/>
+                <w:sz w:val="18"/>
               </w:rPr>
               <w:t>MySQL lookup</w:t>
             </w:r>
@@ -708,14 +657,12 @@
             </w:tcMar>
           </w:tcPr>
           <w:p>
-            <w:pPr>
-              <w:spacing w:after="40"/>
-            </w:pPr>
             <w:r>
               <w:rPr>
-                <w:sz w:val="19"/>
+                <w:rFonts w:ascii="Arial" w:hAnsi="Arial"/>
+                <w:sz w:val="18"/>
               </w:rPr>
-              <w:t>code/mysql_lookup.py</w:t>
+              <w:t>scr_code/mysql_lookup.py</w:t>
             </w:r>
           </w:p>
         </w:tc>
@@ -737,14 +684,12 @@
             </w:tcMar>
           </w:tcPr>
           <w:p>
-            <w:pPr>
-              <w:spacing w:after="40"/>
-            </w:pPr>
             <w:r>
               <w:rPr>
-                <w:sz w:val="19"/>
+                <w:rFonts w:ascii="Arial" w:hAnsi="Arial"/>
+                <w:sz w:val="18"/>
               </w:rPr>
-              <w:t>Builds schema context, asks Gemini to generate SELECT/WITH SQL, validates it, and executes through LangChain SQLDatabase.</w:t>
+              <w:t>Builds schema context, uses the code model route to generate SELECT or WITH SQL, validates it, and executes through LangChain SQLDatabase.</w:t>
             </w:r>
           </w:p>
         </w:tc>
@@ -768,12 +713,10 @@
             </w:tcMar>
           </w:tcPr>
           <w:p>
-            <w:pPr>
-              <w:spacing w:after="40"/>
-            </w:pPr>
             <w:r>
               <w:rPr>
-                <w:sz w:val="19"/>
+                <w:rFonts w:ascii="Arial" w:hAnsi="Arial"/>
+                <w:sz w:val="18"/>
               </w:rPr>
               <w:t>Agent graph</w:t>
             </w:r>
@@ -797,14 +740,12 @@
             </w:tcMar>
           </w:tcPr>
           <w:p>
-            <w:pPr>
-              <w:spacing w:after="40"/>
-            </w:pPr>
             <w:r>
               <w:rPr>
-                <w:sz w:val="19"/>
+                <w:rFonts w:ascii="Arial" w:hAnsi="Arial"/>
+                <w:sz w:val="18"/>
               </w:rPr>
-              <w:t>code/procurement_graph.py</w:t>
+              <w:t>scr_code/procurement_graph.py</w:t>
             </w:r>
           </w:p>
         </w:tc>
@@ -826,14 +767,12 @@
             </w:tcMar>
           </w:tcPr>
           <w:p>
-            <w:pPr>
-              <w:spacing w:after="40"/>
-            </w:pPr>
             <w:r>
               <w:rPr>
-                <w:sz w:val="19"/>
+                <w:rFonts w:ascii="Arial" w:hAnsi="Arial"/>
+                <w:sz w:val="18"/>
               </w:rPr>
-              <w:t>Defines ProcurementState, three tools, MemorySaver checkpointing, and the LangGraph tool loop.</w:t>
+              <w:t>Defines ProcurementState, task routing, three tools, MemorySaver checkpointing, and the LangGraph tool loop.</w:t>
             </w:r>
           </w:p>
         </w:tc>
@@ -1260,7 +1199,7 @@
     </w:p>
     <w:p>
       <w:r>
-        <w:t>The Supplier Contract tool maps to the code-level tool name supplier_contract. It embeds the natural-language query with the same Hugging Face model used during ingestion, then runs a MongoDB aggregation pipeline with the $vectorSearch stage. The tool returns chunk text, metadata, and vector similarity score as context for Gemini.</w:t>
+        <w:t>The Supplier Contract tool maps to the code-level tool name supplier_contract. It embeds the natural-language query with the same Hugging Face model used during ingestion, then runs a MongoDB aggregation pipeline with the $vectorSearch stage. The returned chunk text, metadata, and vector similarity score become context for the LiteLLM-routed RAG model.</w:t>
       </w:r>
     </w:p>
     <w:p>
@@ -1313,7 +1252,7 @@
     </w:p>
     <w:p>
       <w:r>
-        <w:t>The Purchase Order and Invoice tools are implemented as separate LangGraph tools but share the same read-only lookup engine in code/mysql_lookup.py. Each tool receives a user question, restricts schema access to its configured table allowlist, asks Gemini to draft one SELECT or WITH query, validates the generated SQL, executes it through SQLDatabase, and returns the SQL plus query results to the main LLM.</w:t>
+        <w:t>The Purchase Order and Invoice tools are implemented as separate LangGraph tools but share the same read-only lookup engine in scr_code/mysql_lookup.py. Each tool receives a user question, restricts schema access to its configured table allowlist, asks the LiteLLM code model group to draft one SELECT or WITH query, validates the generated SQL, executes it through SQLDatabase, and returns the SQL plus query results to the selected answer model.</w:t>
       </w:r>
     </w:p>
     <w:tbl>
@@ -1944,7 +1883,7 @@
     </w:p>
     <w:p>
       <w:r>
-        <w:t>The active graph is a StateGraph parameterized with a custom ProcurementState class. ProcurementState inherits MessagesState, so LangGraph still merges chat messages normally, while adding project-specific fields used to inspect and retain retrieval behavior.</w:t>
+        <w:t>The active graph is a StateGraph parameterized with a custom ProcurementState class. ProcurementState inherits MessagesState, so LangGraph still merges chat messages normally, while adding project-specific retrieval fields and task_type, the classification selected for the current user turn.</w:t>
       </w:r>
     </w:p>
     <w:tbl>
@@ -1978,14 +1917,10 @@
             <w:shd w:fill="F2F4F7"/>
           </w:tcPr>
           <w:p>
-            <w:pPr>
-              <w:spacing w:after="40"/>
-            </w:pPr>
             <w:r>
               <w:rPr>
-                <w:b/>
-                <w:color w:val="0B2545"/>
-                <w:sz w:val="19"/>
+                <w:rFonts w:ascii="Arial" w:hAnsi="Arial"/>
+                <w:sz w:val="18"/>
               </w:rPr>
               <w:t>State Field</w:t>
             </w:r>
@@ -2010,14 +1945,10 @@
             <w:shd w:fill="F2F4F7"/>
           </w:tcPr>
           <w:p>
-            <w:pPr>
-              <w:spacing w:after="40"/>
-            </w:pPr>
             <w:r>
               <w:rPr>
-                <w:b/>
-                <w:color w:val="0B2545"/>
-                <w:sz w:val="19"/>
+                <w:rFonts w:ascii="Arial" w:hAnsi="Arial"/>
+                <w:sz w:val="18"/>
               </w:rPr>
               <w:t>Meaning</w:t>
             </w:r>
@@ -2043,12 +1974,10 @@
             </w:tcMar>
           </w:tcPr>
           <w:p>
-            <w:pPr>
-              <w:spacing w:after="40"/>
-            </w:pPr>
             <w:r>
               <w:rPr>
-                <w:sz w:val="19"/>
+                <w:rFonts w:ascii="Arial" w:hAnsi="Arial"/>
+                <w:sz w:val="18"/>
               </w:rPr>
               <w:t>messages</w:t>
             </w:r>
@@ -2072,12 +2001,10 @@
             </w:tcMar>
           </w:tcPr>
           <w:p>
-            <w:pPr>
-              <w:spacing w:after="40"/>
-            </w:pPr>
             <w:r>
               <w:rPr>
-                <w:sz w:val="19"/>
+                <w:rFonts w:ascii="Arial" w:hAnsi="Arial"/>
+                <w:sz w:val="18"/>
               </w:rPr>
               <w:t>Inherited message history: human messages, AI responses, tool calls, and tool results. This is the primary conversation memory.</w:t>
             </w:r>
@@ -2103,12 +2030,10 @@
             </w:tcMar>
           </w:tcPr>
           <w:p>
-            <w:pPr>
-              <w:spacing w:after="40"/>
-            </w:pPr>
             <w:r>
               <w:rPr>
-                <w:sz w:val="19"/>
+                <w:rFonts w:ascii="Arial" w:hAnsi="Arial"/>
+                <w:sz w:val="18"/>
               </w:rPr>
               <w:t>current_question</w:t>
             </w:r>
@@ -2132,12 +2057,10 @@
             </w:tcMar>
           </w:tcPr>
           <w:p>
-            <w:pPr>
-              <w:spacing w:after="40"/>
-            </w:pPr>
             <w:r>
               <w:rPr>
-                <w:sz w:val="19"/>
+                <w:rFonts w:ascii="Arial" w:hAnsi="Arial"/>
+                <w:sz w:val="18"/>
               </w:rPr>
               <w:t>Latest human question extracted during the LLM node.</w:t>
             </w:r>
@@ -2163,12 +2086,66 @@
             </w:tcMar>
           </w:tcPr>
           <w:p>
-            <w:pPr>
-              <w:spacing w:after="40"/>
-            </w:pPr>
             <w:r>
               <w:rPr>
-                <w:sz w:val="19"/>
+                <w:rFonts w:ascii="Arial" w:hAnsi="Arial"/>
+                <w:sz w:val="18"/>
+              </w:rPr>
+              <w:t>task_type</w:t>
+            </w:r>
+          </w:p>
+        </w:tc>
+        <w:tc>
+          <w:tcPr>
+            <w:tcW w:type="dxa" w:w="7056"/>
+            <w:vAlign w:val="center"/>
+            <w:tcBorders>
+              <w:top w:val="single" w:sz="6" w:space="0" w:color="D1D5DB"/>
+              <w:left w:val="single" w:sz="6" w:space="0" w:color="D1D5DB"/>
+              <w:bottom w:val="single" w:sz="6" w:space="0" w:color="D1D5DB"/>
+              <w:right w:val="single" w:sz="6" w:space="0" w:color="D1D5DB"/>
+            </w:tcBorders>
+            <w:tcMar>
+              <w:top w:w="80" w:type="dxa"/>
+              <w:start w:w="120" w:type="dxa"/>
+              <w:bottom w:w="80" w:type="dxa"/>
+              <w:end w:w="120" w:type="dxa"/>
+            </w:tcMar>
+          </w:tcPr>
+          <w:p>
+            <w:r>
+              <w:rPr>
+                <w:rFonts w:ascii="Arial" w:hAnsi="Arial"/>
+                <w:sz w:val="18"/>
+              </w:rPr>
+              <w:t>The general, code, or RAG model group selected by Gemini for the active user turn.</w:t>
+            </w:r>
+          </w:p>
+        </w:tc>
+      </w:tr>
+      <w:tr>
+        <w:tc>
+          <w:tcPr>
+            <w:tcW w:type="dxa" w:w="2304"/>
+            <w:vAlign w:val="center"/>
+            <w:tcBorders>
+              <w:top w:val="single" w:sz="6" w:space="0" w:color="D1D5DB"/>
+              <w:left w:val="single" w:sz="6" w:space="0" w:color="D1D5DB"/>
+              <w:bottom w:val="single" w:sz="6" w:space="0" w:color="D1D5DB"/>
+              <w:right w:val="single" w:sz="6" w:space="0" w:color="D1D5DB"/>
+            </w:tcBorders>
+            <w:tcMar>
+              <w:top w:w="80" w:type="dxa"/>
+              <w:start w:w="120" w:type="dxa"/>
+              <w:bottom w:w="80" w:type="dxa"/>
+              <w:end w:w="120" w:type="dxa"/>
+            </w:tcMar>
+          </w:tcPr>
+          <w:p>
+            <w:r>
+              <w:rPr>
+                <w:rFonts w:ascii="Arial" w:hAnsi="Arial"/>
+                <w:sz w:val="18"/>
               </w:rPr>
               <w:t>retrieved_context</w:t>
             </w:r>
@@ -2192,12 +2169,10 @@
             </w:tcMar>
           </w:tcPr>
           <w:p>
-            <w:pPr>
-              <w:spacing w:after="40"/>
-            </w:pPr>
             <w:r>
               <w:rPr>
-                <w:sz w:val="19"/>
+                <w:rFonts w:ascii="Arial" w:hAnsi="Arial"/>
+                <w:sz w:val="18"/>
               </w:rPr>
               <w:t>Latest tool output, whether from MongoDB, Purchase Order, or Invoice lookup.</w:t>
             </w:r>
@@ -2223,12 +2198,10 @@
             </w:tcMar>
           </w:tcPr>
           <w:p>
-            <w:pPr>
-              <w:spacing w:after="40"/>
-            </w:pPr>
             <w:r>
               <w:rPr>
-                <w:sz w:val="19"/>
+                <w:rFonts w:ascii="Arial" w:hAnsi="Arial"/>
+                <w:sz w:val="18"/>
               </w:rPr>
               <w:t>tool_context</w:t>
             </w:r>
@@ -2252,12 +2225,10 @@
             </w:tcMar>
           </w:tcPr>
           <w:p>
-            <w:pPr>
-              <w:spacing w:after="40"/>
-            </w:pPr>
             <w:r>
               <w:rPr>
-                <w:sz w:val="19"/>
+                <w:rFonts w:ascii="Arial" w:hAnsi="Arial"/>
+                <w:sz w:val="18"/>
               </w:rPr>
               <w:t>Dictionary of tool outputs keyed by tool name; latest value is retained per tool name.</w:t>
             </w:r>
@@ -2267,28 +2238,13 @@
       <w:tr>
         <w:tc>
           <w:tcPr>
-            <w:tcW w:type="dxa" w:w="2304"/>
-            <w:vAlign w:val="center"/>
-            <w:tcBorders>
-              <w:top w:val="single" w:sz="6" w:space="0" w:color="D1D5DB"/>
-              <w:left w:val="single" w:sz="6" w:space="0" w:color="D1D5DB"/>
-              <w:bottom w:val="single" w:sz="6" w:space="0" w:color="D1D5DB"/>
-              <w:right w:val="single" w:sz="6" w:space="0" w:color="D1D5DB"/>
-            </w:tcBorders>
-            <w:tcMar>
-              <w:top w:w="80" w:type="dxa"/>
-              <w:start w:w="120" w:type="dxa"/>
-              <w:bottom w:w="80" w:type="dxa"/>
-              <w:end w:w="120" w:type="dxa"/>
-            </w:tcMar>
+            <w:tcW w:type="dxa" w:w="4968"/>
           </w:tcPr>
           <w:p>
-            <w:pPr>
-              <w:spacing w:after="40"/>
-            </w:pPr>
             <w:r>
               <w:rPr>
-                <w:sz w:val="19"/>
+                <w:rFonts w:ascii="Arial" w:hAnsi="Arial"/>
+                <w:sz w:val="18"/>
               </w:rPr>
               <w:t>retrieval_count</w:t>
             </w:r>
@@ -2296,28 +2252,13 @@
         </w:tc>
         <w:tc>
           <w:tcPr>
-            <w:tcW w:type="dxa" w:w="7056"/>
-            <w:vAlign w:val="center"/>
-            <w:tcBorders>
-              <w:top w:val="single" w:sz="6" w:space="0" w:color="D1D5DB"/>
-              <w:left w:val="single" w:sz="6" w:space="0" w:color="D1D5DB"/>
-              <w:bottom w:val="single" w:sz="6" w:space="0" w:color="D1D5DB"/>
-              <w:right w:val="single" w:sz="6" w:space="0" w:color="D1D5DB"/>
-            </w:tcBorders>
-            <w:tcMar>
-              <w:top w:w="80" w:type="dxa"/>
-              <w:start w:w="120" w:type="dxa"/>
-              <w:bottom w:w="80" w:type="dxa"/>
-              <w:end w:w="120" w:type="dxa"/>
-            </w:tcMar>
+            <w:tcW w:type="dxa" w:w="4968"/>
           </w:tcPr>
           <w:p>
-            <w:pPr>
-              <w:spacing w:after="40"/>
-            </w:pPr>
             <w:r>
               <w:rPr>
-                <w:sz w:val="19"/>
+                <w:rFonts w:ascii="Arial" w:hAnsi="Arial"/>
+                <w:sz w:val="18"/>
               </w:rPr>
               <w:t>Count of matching tool messages currently present in the graph state.</w:t>
             </w:r>
@@ -2366,14 +2307,10 @@
             <w:shd w:fill="E8EEF5"/>
           </w:tcPr>
           <w:p>
-            <w:pPr>
-              <w:spacing w:after="40"/>
-            </w:pPr>
             <w:r>
               <w:rPr>
-                <w:b/>
-                <w:color w:val="0B2545"/>
-                <w:sz w:val="19"/>
+                <w:rFonts w:ascii="Arial" w:hAnsi="Arial"/>
+                <w:sz w:val="18"/>
               </w:rPr>
               <w:t>Graph Step</w:t>
             </w:r>
@@ -2398,14 +2335,10 @@
             <w:shd w:fill="E8EEF5"/>
           </w:tcPr>
           <w:p>
-            <w:pPr>
-              <w:spacing w:after="40"/>
-            </w:pPr>
             <w:r>
               <w:rPr>
-                <w:b/>
-                <w:color w:val="0B2545"/>
-                <w:sz w:val="19"/>
+                <w:rFonts w:ascii="Arial" w:hAnsi="Arial"/>
+                <w:sz w:val="18"/>
               </w:rPr>
               <w:t>Behavior</w:t>
             </w:r>
@@ -2431,12 +2364,10 @@
             </w:tcMar>
           </w:tcPr>
           <w:p>
-            <w:pPr>
-              <w:spacing w:after="40"/>
-            </w:pPr>
             <w:r>
               <w:rPr>
-                <w:sz w:val="19"/>
+                <w:rFonts w:ascii="Arial" w:hAnsi="Arial"/>
+                <w:sz w:val="18"/>
               </w:rPr>
               <w:t>START -&gt; llm_with_tool</w:t>
             </w:r>
@@ -2460,14 +2391,12 @@
             </w:tcMar>
           </w:tcPr>
           <w:p>
-            <w:pPr>
-              <w:spacing w:after="40"/>
-            </w:pPr>
             <w:r>
               <w:rPr>
-                <w:sz w:val="19"/>
+                <w:rFonts w:ascii="Arial" w:hAnsi="Arial"/>
+                <w:sz w:val="18"/>
               </w:rPr>
-              <w:t>Gemini receives the system prompt and conversation messages.</w:t>
+              <w:t>LangGraph loads the thread memory. For a new user question, Gemini Flash classifies its purpose and the LiteLLM gateway selects a model group.</w:t>
             </w:r>
           </w:p>
         </w:tc>
@@ -2491,12 +2420,10 @@
             </w:tcMar>
           </w:tcPr>
           <w:p>
-            <w:pPr>
-              <w:spacing w:after="40"/>
-            </w:pPr>
             <w:r>
               <w:rPr>
-                <w:sz w:val="19"/>
+                <w:rFonts w:ascii="Arial" w:hAnsi="Arial"/>
+                <w:sz w:val="18"/>
               </w:rPr>
               <w:t>llm_with_tool -&gt; tools_condition</w:t>
             </w:r>
@@ -2520,14 +2447,12 @@
             </w:tcMar>
           </w:tcPr>
           <w:p>
-            <w:pPr>
-              <w:spacing w:after="40"/>
-            </w:pPr>
             <w:r>
               <w:rPr>
-                <w:sz w:val="19"/>
+                <w:rFonts w:ascii="Arial" w:hAnsi="Arial"/>
+                <w:sz w:val="18"/>
               </w:rPr>
-              <w:t>Gemini either answers directly or emits a tool call.</w:t>
+              <w:t>The selected model either answers directly or emits a procurement tool call.</w:t>
             </w:r>
           </w:p>
         </w:tc>
@@ -2551,12 +2476,10 @@
             </w:tcMar>
           </w:tcPr>
           <w:p>
-            <w:pPr>
-              <w:spacing w:after="40"/>
-            </w:pPr>
             <w:r>
               <w:rPr>
-                <w:sz w:val="19"/>
+                <w:rFonts w:ascii="Arial" w:hAnsi="Arial"/>
+                <w:sz w:val="18"/>
               </w:rPr>
               <w:t>tools -&gt; update_retrieval_state</w:t>
             </w:r>
@@ -2580,12 +2503,10 @@
             </w:tcMar>
           </w:tcPr>
           <w:p>
-            <w:pPr>
-              <w:spacing w:after="40"/>
-            </w:pPr>
             <w:r>
               <w:rPr>
-                <w:sz w:val="19"/>
+                <w:rFonts w:ascii="Arial" w:hAnsi="Arial"/>
+                <w:sz w:val="18"/>
               </w:rPr>
               <w:t>ToolNode executes supplier_contract, purchase_order, or invoice and appends a ToolMessage.</w:t>
             </w:r>
@@ -2611,12 +2532,10 @@
             </w:tcMar>
           </w:tcPr>
           <w:p>
-            <w:pPr>
-              <w:spacing w:after="40"/>
-            </w:pPr>
             <w:r>
               <w:rPr>
-                <w:sz w:val="19"/>
+                <w:rFonts w:ascii="Arial" w:hAnsi="Arial"/>
+                <w:sz w:val="18"/>
               </w:rPr>
               <w:t>update_retrieval_state -&gt; llm_with_tool</w:t>
             </w:r>
@@ -2640,14 +2559,12 @@
             </w:tcMar>
           </w:tcPr>
           <w:p>
-            <w:pPr>
-              <w:spacing w:after="40"/>
-            </w:pPr>
             <w:r>
               <w:rPr>
-                <w:sz w:val="19"/>
+                <w:rFonts w:ascii="Arial" w:hAnsi="Arial"/>
+                <w:sz w:val="18"/>
               </w:rPr>
-              <w:t>Latest tool context is copied into custom state, then Gemini receives the enriched message history.</w:t>
+              <w:t>Latest tool context is copied into custom state, then the same selected model receives the enriched message history.</w:t>
             </w:r>
           </w:p>
         </w:tc>
@@ -2671,12 +2588,10 @@
             </w:tcMar>
           </w:tcPr>
           <w:p>
-            <w:pPr>
-              <w:spacing w:after="40"/>
-            </w:pPr>
             <w:r>
               <w:rPr>
-                <w:sz w:val="19"/>
+                <w:rFonts w:ascii="Arial" w:hAnsi="Arial"/>
+                <w:sz w:val="18"/>
               </w:rPr>
               <w:t>llm_with_tool -&gt; END</w:t>
             </w:r>
@@ -2700,12 +2615,10 @@
             </w:tcMar>
           </w:tcPr>
           <w:p>
-            <w:pPr>
-              <w:spacing w:after="40"/>
-            </w:pPr>
             <w:r>
               <w:rPr>
-                <w:sz w:val="19"/>
+                <w:rFonts w:ascii="Arial" w:hAnsi="Arial"/>
+                <w:sz w:val="18"/>
               </w:rPr>
               <w:t>When no further tool call is needed, the final answer is returned.</w:t>
             </w:r>
@@ -2723,7 +2636,7 @@
         <w:pStyle w:val="Heading1"/>
       </w:pPr>
       <w:r>
-        <w:t>7. Runtime Answer Flow</w:t>
+        <w:t>7. Runtime Answer Flow with LiteLLM Gateway</w:t>
       </w:r>
     </w:p>
     <w:p>
@@ -2733,7 +2646,7 @@
         <w:ind w:left="360"/>
       </w:pPr>
       <w:r>
-        <w:t>User submits a question and optional thread_id through the CLI ask path.</w:t>
+        <w:t>User submits a question through the CLI or Streamlit interface. Streamlit generates and retains one thread_id for the session.</w:t>
       </w:r>
     </w:p>
     <w:p>
@@ -2753,7 +2666,7 @@
         <w:ind w:left="360"/>
       </w:pPr>
       <w:r>
-        <w:t>Gemini reads the system prompt and decides whether the question needs Supplier Contract, Purchase Order, or Invoice data.</w:t>
+        <w:t>Gemini gemini-3.7-flash classifies the new request as general, code, or RAG. The classification is retained during any tool loop for that turn.</w:t>
       </w:r>
     </w:p>
     <w:p>
@@ -2763,7 +2676,7 @@
         <w:ind w:left="360"/>
       </w:pPr>
       <w:r>
-        <w:t>For Supplier Contract questions, the graph retrieves semantic chunks from MongoDB Atlas.</w:t>
+        <w:t>The LiteLLM Router uses the corresponding model group, a local cache, and latency-based routing to choose the fastest healthy deployment.</w:t>
       </w:r>
     </w:p>
     <w:p>
@@ -2773,7 +2686,7 @@
         <w:ind w:left="360"/>
       </w:pPr>
       <w:r>
-        <w:t>For Purchase Order or Invoice questions, the selected MySQL tool prepares schema context, generates safe SQL, executes it, and returns rows.</w:t>
+        <w:t>The selected model reads the system prompt and decides whether Supplier Contract, Purchase Order, or Invoice data is required.</w:t>
       </w:r>
     </w:p>
     <w:p>
@@ -2783,7 +2696,7 @@
         <w:ind w:left="360"/>
       </w:pPr>
       <w:r>
-        <w:t>The tool result is appended to messages, copied into custom state, and sent back to Gemini.</w:t>
+        <w:t>Supplier Contract retrieves semantic chunks from MongoDB Atlas. Purchase Order and Invoice prepare schema context and use the code model group to generate and validate safe SQL before executing it.</w:t>
       </w:r>
     </w:p>
     <w:p>
@@ -2793,7 +2706,7 @@
         <w:ind w:left="360"/>
       </w:pPr>
       <w:r>
-        <w:t>Gemini can call another tool if needed; otherwise it synthesizes a natural-language answer grounded in the returned context.</w:t>
+        <w:t>Tool output is appended to messages, copied into custom state, and returned to the selected model. It can call another tool if needed; otherwise it synthesizes a grounded natural-language answer.</w:t>
       </w:r>
     </w:p>
     <w:p>
@@ -2836,14 +2749,10 @@
             <w:shd w:fill="F2F4F7"/>
           </w:tcPr>
           <w:p>
-            <w:pPr>
-              <w:spacing w:after="40"/>
-            </w:pPr>
             <w:r>
               <w:rPr>
-                <w:b/>
-                <w:color w:val="0B2545"/>
-                <w:sz w:val="19"/>
+                <w:rFonts w:ascii="Arial" w:hAnsi="Arial"/>
+                <w:sz w:val="18"/>
               </w:rPr>
               <w:t>Setting</w:t>
             </w:r>
@@ -2868,14 +2777,10 @@
             <w:shd w:fill="F2F4F7"/>
           </w:tcPr>
           <w:p>
-            <w:pPr>
-              <w:spacing w:after="40"/>
-            </w:pPr>
             <w:r>
               <w:rPr>
-                <w:b/>
-                <w:color w:val="0B2545"/>
-                <w:sz w:val="19"/>
+                <w:rFonts w:ascii="Arial" w:hAnsi="Arial"/>
+                <w:sz w:val="18"/>
               </w:rPr>
               <w:t>Used By</w:t>
             </w:r>
@@ -2900,14 +2805,10 @@
             <w:shd w:fill="F2F4F7"/>
           </w:tcPr>
           <w:p>
-            <w:pPr>
-              <w:spacing w:after="40"/>
-            </w:pPr>
             <w:r>
               <w:rPr>
-                <w:b/>
-                <w:color w:val="0B2545"/>
-                <w:sz w:val="19"/>
+                <w:rFonts w:ascii="Arial" w:hAnsi="Arial"/>
+                <w:sz w:val="18"/>
               </w:rPr>
               <w:t>Notes</w:t>
             </w:r>
@@ -2933,12 +2834,93 @@
             </w:tcMar>
           </w:tcPr>
           <w:p>
-            <w:pPr>
-              <w:spacing w:after="40"/>
-            </w:pPr>
             <w:r>
               <w:rPr>
-                <w:sz w:val="19"/>
+                <w:rFonts w:ascii="Arial" w:hAnsi="Arial"/>
+                <w:sz w:val="18"/>
+              </w:rPr>
+              <w:t>GROQ_API_KEY</w:t>
+            </w:r>
+          </w:p>
+        </w:tc>
+        <w:tc>
+          <w:tcPr>
+            <w:tcW w:type="dxa" w:w="2736"/>
+            <w:vAlign w:val="center"/>
+            <w:tcBorders>
+              <w:top w:val="single" w:sz="6" w:space="0" w:color="D1D5DB"/>
+              <w:left w:val="single" w:sz="6" w:space="0" w:color="D1D5DB"/>
+              <w:bottom w:val="single" w:sz="6" w:space="0" w:color="D1D5DB"/>
+              <w:right w:val="single" w:sz="6" w:space="0" w:color="D1D5DB"/>
+            </w:tcBorders>
+            <w:tcMar>
+              <w:top w:w="80" w:type="dxa"/>
+              <w:start w:w="120" w:type="dxa"/>
+              <w:bottom w:w="80" w:type="dxa"/>
+              <w:end w:w="120" w:type="dxa"/>
+            </w:tcMar>
+          </w:tcPr>
+          <w:p>
+            <w:r>
+              <w:rPr>
+                <w:rFonts w:ascii="Arial" w:hAnsi="Arial"/>
+                <w:sz w:val="18"/>
+              </w:rPr>
+              <w:t>scr_code/llm_gateway.py</w:t>
+            </w:r>
+          </w:p>
+        </w:tc>
+        <w:tc>
+          <w:tcPr>
+            <w:tcW w:type="dxa" w:w="4104"/>
+            <w:vAlign w:val="center"/>
+            <w:tcBorders>
+              <w:top w:val="single" w:sz="6" w:space="0" w:color="D1D5DB"/>
+              <w:left w:val="single" w:sz="6" w:space="0" w:color="D1D5DB"/>
+              <w:bottom w:val="single" w:sz="6" w:space="0" w:color="D1D5DB"/>
+              <w:right w:val="single" w:sz="6" w:space="0" w:color="D1D5DB"/>
+            </w:tcBorders>
+            <w:tcMar>
+              <w:top w:w="80" w:type="dxa"/>
+              <w:start w:w="120" w:type="dxa"/>
+              <w:bottom w:w="80" w:type="dxa"/>
+              <w:end w:w="120" w:type="dxa"/>
+            </w:tcMar>
+          </w:tcPr>
+          <w:p>
+            <w:r>
+              <w:rPr>
+                <w:rFonts w:ascii="Arial" w:hAnsi="Arial"/>
+                <w:sz w:val="18"/>
+              </w:rPr>
+              <w:t>Required for the code and general Groq model deployments.</w:t>
+            </w:r>
+          </w:p>
+        </w:tc>
+      </w:tr>
+      <w:tr>
+        <w:tc>
+          <w:tcPr>
+            <w:tcW w:type="dxa" w:w="2520"/>
+            <w:vAlign w:val="center"/>
+            <w:tcBorders>
+              <w:top w:val="single" w:sz="6" w:space="0" w:color="D1D5DB"/>
+              <w:left w:val="single" w:sz="6" w:space="0" w:color="D1D5DB"/>
+              <w:bottom w:val="single" w:sz="6" w:space="0" w:color="D1D5DB"/>
+              <w:right w:val="single" w:sz="6" w:space="0" w:color="D1D5DB"/>
+            </w:tcBorders>
+            <w:tcMar>
+              <w:top w:w="80" w:type="dxa"/>
+              <w:start w:w="120" w:type="dxa"/>
+              <w:bottom w:w="80" w:type="dxa"/>
+              <w:end w:w="120" w:type="dxa"/>
+            </w:tcMar>
+          </w:tcPr>
+          <w:p>
+            <w:r>
+              <w:rPr>
+                <w:rFonts w:ascii="Arial" w:hAnsi="Arial"/>
+                <w:sz w:val="18"/>
               </w:rPr>
               <w:t>GOOGLE_API_KEY</w:t>
             </w:r>
@@ -2962,14 +2944,12 @@
             </w:tcMar>
           </w:tcPr>
           <w:p>
-            <w:pPr>
-              <w:spacing w:after="40"/>
-            </w:pPr>
             <w:r>
               <w:rPr>
-                <w:sz w:val="19"/>
+                <w:rFonts w:ascii="Arial" w:hAnsi="Arial"/>
+                <w:sz w:val="18"/>
               </w:rPr>
-              <w:t>code/google_llm.py</w:t>
+              <w:t>scr_code/llm_gateway.py</w:t>
             </w:r>
           </w:p>
         </w:tc>
@@ -2991,14 +2971,12 @@
             </w:tcMar>
           </w:tcPr>
           <w:p>
-            <w:pPr>
-              <w:spacing w:after="40"/>
-            </w:pPr>
             <w:r>
               <w:rPr>
-                <w:sz w:val="19"/>
+                <w:rFonts w:ascii="Arial" w:hAnsi="Arial"/>
+                <w:sz w:val="18"/>
               </w:rPr>
-              <w:t>Required for every LLM call, including SQL generation.</w:t>
+              <w:t>Required for the Gemini classifier and RAG model deployments.</w:t>
             </w:r>
           </w:p>
         </w:tc>
@@ -3022,14 +3000,12 @@
             </w:tcMar>
           </w:tcPr>
           <w:p>
-            <w:pPr>
-              <w:spacing w:after="40"/>
-            </w:pPr>
             <w:r>
               <w:rPr>
-                <w:sz w:val="19"/>
+                <w:rFonts w:ascii="Arial" w:hAnsi="Arial"/>
+                <w:sz w:val="18"/>
               </w:rPr>
-              <w:t>GOOGLE_MODEL</w:t>
+              <w:t>LANGSMITH_API_KEY / TRACING / PROJECT</w:t>
             </w:r>
           </w:p>
         </w:tc>
@@ -3051,14 +3027,12 @@
             </w:tcMar>
           </w:tcPr>
           <w:p>
-            <w:pPr>
-              <w:spacing w:after="40"/>
-            </w:pPr>
             <w:r>
               <w:rPr>
-                <w:sz w:val="19"/>
+                <w:rFonts w:ascii="Arial" w:hAnsi="Arial"/>
+                <w:sz w:val="18"/>
               </w:rPr>
-              <w:t>code/google_llm.py</w:t>
+              <w:t>scr_code/config.py</w:t>
             </w:r>
           </w:p>
         </w:tc>
@@ -3080,14 +3054,12 @@
             </w:tcMar>
           </w:tcPr>
           <w:p>
-            <w:pPr>
-              <w:spacing w:after="40"/>
-            </w:pPr>
             <w:r>
               <w:rPr>
-                <w:sz w:val="19"/>
+                <w:rFonts w:ascii="Arial" w:hAnsi="Arial"/>
+                <w:sz w:val="18"/>
               </w:rPr>
-              <w:t>Defaults to gemini-3.6-flash in the current code.</w:t>
+              <w:t>Enables LangSmith traces for graph, tool, and model calls.</w:t>
             </w:r>
           </w:p>
         </w:tc>
@@ -3111,12 +3083,10 @@
             </w:tcMar>
           </w:tcPr>
           <w:p>
-            <w:pPr>
-              <w:spacing w:after="40"/>
-            </w:pPr>
             <w:r>
               <w:rPr>
-                <w:sz w:val="19"/>
+                <w:rFonts w:ascii="Arial" w:hAnsi="Arial"/>
+                <w:sz w:val="18"/>
               </w:rPr>
               <w:t>MONGODB_URI</w:t>
             </w:r>
@@ -3140,14 +3110,12 @@
             </w:tcMar>
           </w:tcPr>
           <w:p>
-            <w:pPr>
-              <w:spacing w:after="40"/>
-            </w:pPr>
             <w:r>
               <w:rPr>
-                <w:sz w:val="19"/>
+                <w:rFonts w:ascii="Arial" w:hAnsi="Arial"/>
+                <w:sz w:val="18"/>
               </w:rPr>
-              <w:t>code/config.py</w:t>
+              <w:t>scr_code/config.py</w:t>
             </w:r>
           </w:p>
         </w:tc>
@@ -3169,12 +3137,10 @@
             </w:tcMar>
           </w:tcPr>
           <w:p>
-            <w:pPr>
-              <w:spacing w:after="40"/>
-            </w:pPr>
             <w:r>
               <w:rPr>
-                <w:sz w:val="19"/>
+                <w:rFonts w:ascii="Arial" w:hAnsi="Arial"/>
+                <w:sz w:val="18"/>
               </w:rPr>
               <w:t>Required by Settings.from_environment, even for graph startup.</w:t>
             </w:r>
@@ -3200,12 +3166,10 @@
             </w:tcMar>
           </w:tcPr>
           <w:p>
-            <w:pPr>
-              <w:spacing w:after="40"/>
-            </w:pPr>
             <w:r>
               <w:rPr>
-                <w:sz w:val="19"/>
+                <w:rFonts w:ascii="Arial" w:hAnsi="Arial"/>
+                <w:sz w:val="18"/>
               </w:rPr>
               <w:t>MONGODB_DATABASE / COLLECTION</w:t>
             </w:r>
@@ -3229,12 +3193,10 @@
             </w:tcMar>
           </w:tcPr>
           <w:p>
-            <w:pPr>
-              <w:spacing w:after="40"/>
-            </w:pPr>
             <w:r>
               <w:rPr>
-                <w:sz w:val="19"/>
+                <w:rFonts w:ascii="Arial" w:hAnsi="Arial"/>
+                <w:sz w:val="18"/>
               </w:rPr>
               <w:t>ingest.py, retrieve.py</w:t>
             </w:r>
@@ -3258,12 +3220,10 @@
             </w:tcMar>
           </w:tcPr>
           <w:p>
-            <w:pPr>
-              <w:spacing w:after="40"/>
-            </w:pPr>
             <w:r>
               <w:rPr>
-                <w:sz w:val="19"/>
+                <w:rFonts w:ascii="Arial" w:hAnsi="Arial"/>
+                <w:sz w:val="18"/>
               </w:rPr>
               <w:t>Selects the Atlas database and collection for chunk storage and retrieval.</w:t>
             </w:r>
@@ -3289,12 +3249,10 @@
             </w:tcMar>
           </w:tcPr>
           <w:p>
-            <w:pPr>
-              <w:spacing w:after="40"/>
-            </w:pPr>
             <w:r>
               <w:rPr>
-                <w:sz w:val="19"/>
+                <w:rFonts w:ascii="Arial" w:hAnsi="Arial"/>
+                <w:sz w:val="18"/>
               </w:rPr>
               <w:t>MONGODB_VECTOR_INDEX</w:t>
             </w:r>
@@ -3318,12 +3276,10 @@
             </w:tcMar>
           </w:tcPr>
           <w:p>
-            <w:pPr>
-              <w:spacing w:after="40"/>
-            </w:pPr>
             <w:r>
               <w:rPr>
-                <w:sz w:val="19"/>
+                <w:rFonts w:ascii="Arial" w:hAnsi="Arial"/>
+                <w:sz w:val="18"/>
               </w:rPr>
               <w:t>ingest.py, retrieve.py</w:t>
             </w:r>
@@ -3347,12 +3303,10 @@
             </w:tcMar>
           </w:tcPr>
           <w:p>
-            <w:pPr>
-              <w:spacing w:after="40"/>
-            </w:pPr>
             <w:r>
               <w:rPr>
-                <w:sz w:val="19"/>
+                <w:rFonts w:ascii="Arial" w:hAnsi="Arial"/>
+                <w:sz w:val="18"/>
               </w:rPr>
               <w:t>Index name used for creation and $vectorSearch.</w:t>
             </w:r>
@@ -3378,12 +3332,10 @@
             </w:tcMar>
           </w:tcPr>
           <w:p>
-            <w:pPr>
-              <w:spacing w:after="40"/>
-            </w:pPr>
             <w:r>
               <w:rPr>
-                <w:sz w:val="19"/>
+                <w:rFonts w:ascii="Arial" w:hAnsi="Arial"/>
+                <w:sz w:val="18"/>
               </w:rPr>
               <w:t>EMBEDDING_MODEL</w:t>
             </w:r>
@@ -3407,12 +3359,10 @@
             </w:tcMar>
           </w:tcPr>
           <w:p>
-            <w:pPr>
-              <w:spacing w:after="40"/>
-            </w:pPr>
             <w:r>
               <w:rPr>
-                <w:sz w:val="19"/>
+                <w:rFonts w:ascii="Arial" w:hAnsi="Arial"/>
+                <w:sz w:val="18"/>
               </w:rPr>
               <w:t>ingest.py, retrieve.py</w:t>
             </w:r>
@@ -3436,12 +3386,10 @@
             </w:tcMar>
           </w:tcPr>
           <w:p>
-            <w:pPr>
-              <w:spacing w:after="40"/>
-            </w:pPr>
             <w:r>
               <w:rPr>
-                <w:sz w:val="19"/>
+                <w:rFonts w:ascii="Arial" w:hAnsi="Arial"/>
+                <w:sz w:val="18"/>
               </w:rPr>
               <w:t>Must remain consistent between ingestion and query retrieval.</w:t>
             </w:r>
@@ -3467,12 +3415,10 @@
             </w:tcMar>
           </w:tcPr>
           <w:p>
-            <w:pPr>
-              <w:spacing w:after="40"/>
-            </w:pPr>
             <w:r>
               <w:rPr>
-                <w:sz w:val="19"/>
+                <w:rFonts w:ascii="Arial" w:hAnsi="Arial"/>
+                <w:sz w:val="18"/>
               </w:rPr>
               <w:t>DATA_DIR</w:t>
             </w:r>
@@ -3496,12 +3442,10 @@
             </w:tcMar>
           </w:tcPr>
           <w:p>
-            <w:pPr>
-              <w:spacing w:after="40"/>
-            </w:pPr>
             <w:r>
               <w:rPr>
-                <w:sz w:val="19"/>
+                <w:rFonts w:ascii="Arial" w:hAnsi="Arial"/>
+                <w:sz w:val="18"/>
               </w:rPr>
               <w:t>ingest.py</w:t>
             </w:r>
@@ -3525,14 +3469,12 @@
             </w:tcMar>
           </w:tcPr>
           <w:p>
-            <w:pPr>
-              <w:spacing w:after="40"/>
-            </w:pPr>
             <w:r>
               <w:rPr>
-                <w:sz w:val="19"/>
+                <w:rFonts w:ascii="Arial" w:hAnsi="Arial"/>
+                <w:sz w:val="18"/>
               </w:rPr>
-              <w:t>Defaults to project-root/data; current sample files are under data_source, so set DATA_DIR when needed.</w:t>
+              <w:t>Defaults to project-root/data; set it when the source folder differs.</w:t>
             </w:r>
           </w:p>
         </w:tc>
@@ -3556,12 +3498,10 @@
             </w:tcMar>
           </w:tcPr>
           <w:p>
-            <w:pPr>
-              <w:spacing w:after="40"/>
-            </w:pPr>
             <w:r>
               <w:rPr>
-                <w:sz w:val="19"/>
+                <w:rFonts w:ascii="Arial" w:hAnsi="Arial"/>
+                <w:sz w:val="18"/>
               </w:rPr>
               <w:t>MYSQL_URI</w:t>
             </w:r>
@@ -3585,12 +3525,10 @@
             </w:tcMar>
           </w:tcPr>
           <w:p>
-            <w:pPr>
-              <w:spacing w:after="40"/>
-            </w:pPr>
             <w:r>
               <w:rPr>
-                <w:sz w:val="19"/>
+                <w:rFonts w:ascii="Arial" w:hAnsi="Arial"/>
+                <w:sz w:val="18"/>
               </w:rPr>
               <w:t>procurement_graph.py, mysql_lookup.py</w:t>
             </w:r>
@@ -3614,12 +3552,10 @@
             </w:tcMar>
           </w:tcPr>
           <w:p>
-            <w:pPr>
-              <w:spacing w:after="40"/>
-            </w:pPr>
             <w:r>
               <w:rPr>
-                <w:sz w:val="19"/>
+                <w:rFonts w:ascii="Arial" w:hAnsi="Arial"/>
+                <w:sz w:val="18"/>
               </w:rPr>
               <w:t>Required for Purchase Order and Invoice tools. Use a read-only database user.</w:t>
             </w:r>
@@ -3645,12 +3581,10 @@
             </w:tcMar>
           </w:tcPr>
           <w:p>
-            <w:pPr>
-              <w:spacing w:after="40"/>
-            </w:pPr>
             <w:r>
               <w:rPr>
-                <w:sz w:val="19"/>
+                <w:rFonts w:ascii="Arial" w:hAnsi="Arial"/>
+                <w:sz w:val="18"/>
               </w:rPr>
               <w:t>MYSQL_PURCHASE_ORDER_TABLES</w:t>
             </w:r>
@@ -3674,12 +3608,10 @@
             </w:tcMar>
           </w:tcPr>
           <w:p>
-            <w:pPr>
-              <w:spacing w:after="40"/>
-            </w:pPr>
             <w:r>
               <w:rPr>
-                <w:sz w:val="19"/>
+                <w:rFonts w:ascii="Arial" w:hAnsi="Arial"/>
+                <w:sz w:val="18"/>
               </w:rPr>
               <w:t>purchase_order tool</w:t>
             </w:r>
@@ -3703,12 +3635,10 @@
             </w:tcMar>
           </w:tcPr>
           <w:p>
-            <w:pPr>
-              <w:spacing w:after="40"/>
-            </w:pPr>
             <w:r>
               <w:rPr>
-                <w:sz w:val="19"/>
+                <w:rFonts w:ascii="Arial" w:hAnsi="Arial"/>
+                <w:sz w:val="18"/>
               </w:rPr>
               <w:t>Comma-separated allowlist for purchase-order tables.</w:t>
             </w:r>
@@ -3718,28 +3648,13 @@
       <w:tr>
         <w:tc>
           <w:tcPr>
-            <w:tcW w:type="dxa" w:w="2520"/>
-            <w:vAlign w:val="center"/>
-            <w:tcBorders>
-              <w:top w:val="single" w:sz="6" w:space="0" w:color="D1D5DB"/>
-              <w:left w:val="single" w:sz="6" w:space="0" w:color="D1D5DB"/>
-              <w:bottom w:val="single" w:sz="6" w:space="0" w:color="D1D5DB"/>
-              <w:right w:val="single" w:sz="6" w:space="0" w:color="D1D5DB"/>
-            </w:tcBorders>
-            <w:tcMar>
-              <w:top w:w="80" w:type="dxa"/>
-              <w:start w:w="120" w:type="dxa"/>
-              <w:bottom w:w="80" w:type="dxa"/>
-              <w:end w:w="120" w:type="dxa"/>
-            </w:tcMar>
+            <w:tcW w:type="dxa" w:w="3312"/>
           </w:tcPr>
           <w:p>
-            <w:pPr>
-              <w:spacing w:after="40"/>
-            </w:pPr>
             <w:r>
               <w:rPr>
-                <w:sz w:val="19"/>
+                <w:rFonts w:ascii="Arial" w:hAnsi="Arial"/>
+                <w:sz w:val="18"/>
               </w:rPr>
               <w:t>MYSQL_INVOICE_TABLES</w:t>
             </w:r>
@@ -3747,28 +3662,13 @@
         </w:tc>
         <w:tc>
           <w:tcPr>
-            <w:tcW w:type="dxa" w:w="2736"/>
-            <w:vAlign w:val="center"/>
-            <w:tcBorders>
-              <w:top w:val="single" w:sz="6" w:space="0" w:color="D1D5DB"/>
-              <w:left w:val="single" w:sz="6" w:space="0" w:color="D1D5DB"/>
-              <w:bottom w:val="single" w:sz="6" w:space="0" w:color="D1D5DB"/>
-              <w:right w:val="single" w:sz="6" w:space="0" w:color="D1D5DB"/>
-            </w:tcBorders>
-            <w:tcMar>
-              <w:top w:w="80" w:type="dxa"/>
-              <w:start w:w="120" w:type="dxa"/>
-              <w:bottom w:w="80" w:type="dxa"/>
-              <w:end w:w="120" w:type="dxa"/>
-            </w:tcMar>
+            <w:tcW w:type="dxa" w:w="3312"/>
           </w:tcPr>
           <w:p>
-            <w:pPr>
-              <w:spacing w:after="40"/>
-            </w:pPr>
             <w:r>
               <w:rPr>
-                <w:sz w:val="19"/>
+                <w:rFonts w:ascii="Arial" w:hAnsi="Arial"/>
+                <w:sz w:val="18"/>
               </w:rPr>
               <w:t>invoice tool</w:t>
             </w:r>
@@ -3776,28 +3676,13 @@
         </w:tc>
         <w:tc>
           <w:tcPr>
-            <w:tcW w:type="dxa" w:w="4104"/>
-            <w:vAlign w:val="center"/>
-            <w:tcBorders>
-              <w:top w:val="single" w:sz="6" w:space="0" w:color="D1D5DB"/>
-              <w:left w:val="single" w:sz="6" w:space="0" w:color="D1D5DB"/>
-              <w:bottom w:val="single" w:sz="6" w:space="0" w:color="D1D5DB"/>
-              <w:right w:val="single" w:sz="6" w:space="0" w:color="D1D5DB"/>
-            </w:tcBorders>
-            <w:tcMar>
-              <w:top w:w="80" w:type="dxa"/>
-              <w:start w:w="120" w:type="dxa"/>
-              <w:bottom w:w="80" w:type="dxa"/>
-              <w:end w:w="120" w:type="dxa"/>
-            </w:tcMar>
+            <w:tcW w:type="dxa" w:w="3312"/>
           </w:tcPr>
           <w:p>
-            <w:pPr>
-              <w:spacing w:after="40"/>
-            </w:pPr>
             <w:r>
               <w:rPr>
-                <w:sz w:val="19"/>
+                <w:rFonts w:ascii="Arial" w:hAnsi="Arial"/>
+                <w:sz w:val="18"/>
               </w:rPr>
               <w:t>Comma-separated allowlist for invoice tables.</w:t>
             </w:r>
@@ -3874,6 +3759,30 @@
       </w:pPr>
       <w:r>
         <w:t>Custom state and checkpointing make multi-turn procurement conversations easier to inspect and extend.</w:t>
+      </w:r>
+    </w:p>
+    <w:p>
+      <w:pPr>
+        <w:pStyle w:val="ListBullet"/>
+      </w:pPr>
+      <w:r>
+        <w:t>LiteLLM separates task intent from provider selection while retaining LangChain-compatible tool calling.</w:t>
+      </w:r>
+    </w:p>
+    <w:p>
+      <w:pPr>
+        <w:pStyle w:val="ListBullet"/>
+      </w:pPr>
+      <w:r>
+        <w:t>LiteLLM separates task intent from provider selection while retaining LangChain-compatible tool calling.</w:t>
+      </w:r>
+    </w:p>
+    <w:p>
+      <w:pPr>
+        <w:pStyle w:val="ListBullet"/>
+      </w:pPr>
+      <w:r>
+        <w:t>LiteLLM separates task intent from provider selection while retaining LangChain-compatible tool calling.</w:t>
       </w:r>
     </w:p>
     <w:p>
@@ -4528,11 +4437,131 @@
           </w:p>
         </w:tc>
       </w:tr>
+      <w:tr>
+        <w:tc>
+          <w:tcPr>
+            <w:tcW w:type="dxa" w:w="3312"/>
+          </w:tcPr>
+          <w:p>
+            <w:r>
+              <w:t>Gateway reliability</w:t>
+            </w:r>
+          </w:p>
+        </w:tc>
+        <w:tc>
+          <w:tcPr>
+            <w:tcW w:type="dxa" w:w="3312"/>
+          </w:tcPr>
+          <w:p>
+            <w:r>
+              <w:t>The local LiteLLM cache is process-scoped; it clears when the application restarts.</w:t>
+            </w:r>
+          </w:p>
+        </w:tc>
+        <w:tc>
+          <w:tcPr>
+            <w:tcW w:type="dxa" w:w="3312"/>
+          </w:tcPr>
+          <w:p>
+            <w:r>
+              <w:t>Use Redis caching and persistent latency metrics for multi-process or production deployment.</w:t>
+            </w:r>
+          </w:p>
+        </w:tc>
+      </w:tr>
+      <w:tr>
+        <w:tc>
+          <w:tcPr>
+            <w:tcW w:type="dxa" w:w="3312"/>
+          </w:tcPr>
+          <w:p>
+            <w:r>
+              <w:t>Gateway reliability</w:t>
+            </w:r>
+          </w:p>
+        </w:tc>
+        <w:tc>
+          <w:tcPr>
+            <w:tcW w:type="dxa" w:w="3312"/>
+          </w:tcPr>
+          <w:p>
+            <w:r>
+              <w:t>The local LiteLLM cache is process-scoped; it clears when the application restarts.</w:t>
+            </w:r>
+          </w:p>
+        </w:tc>
+        <w:tc>
+          <w:tcPr>
+            <w:tcW w:type="dxa" w:w="3312"/>
+          </w:tcPr>
+          <w:p>
+            <w:r>
+              <w:t>Use Redis caching and persistent latency metrics for multi-process or production deployment.</w:t>
+            </w:r>
+          </w:p>
+        </w:tc>
+      </w:tr>
+      <w:tr>
+        <w:tc>
+          <w:tcPr>
+            <w:tcW w:type="dxa" w:w="3312"/>
+          </w:tcPr>
+          <w:p>
+            <w:r>
+              <w:t>Gateway reliability</w:t>
+            </w:r>
+          </w:p>
+        </w:tc>
+        <w:tc>
+          <w:tcPr>
+            <w:tcW w:type="dxa" w:w="3312"/>
+          </w:tcPr>
+          <w:p>
+            <w:r>
+              <w:t>The local LiteLLM cache is process-scoped; it clears when the application restarts.</w:t>
+            </w:r>
+          </w:p>
+        </w:tc>
+        <w:tc>
+          <w:tcPr>
+            <w:tcW w:type="dxa" w:w="3312"/>
+          </w:tcPr>
+          <w:p>
+            <w:r>
+              <w:t>Use Redis caching and persistent latency metrics for multi-process or production deployment.</w:t>
+            </w:r>
+          </w:p>
+        </w:tc>
+      </w:tr>
     </w:tbl>
     <w:p>
       <w:pPr>
         <w:spacing w:after="40"/>
       </w:pPr>
+    </w:p>
+    <w:p>
+      <w:pPr>
+        <w:pStyle w:val="ListBullet"/>
+      </w:pPr>
+      <w:r>
+        <w:t>Move the local LiteLLM cache to Redis and monitor deployment latency and failover events before multi-process production deployment.</w:t>
+      </w:r>
+    </w:p>
+    <w:p>
+      <w:pPr>
+        <w:pStyle w:val="ListBullet"/>
+      </w:pPr>
+      <w:r>
+        <w:t>Move the local LiteLLM cache to Redis and monitor deployment latency and failover events before multi-process production deployment.</w:t>
+      </w:r>
+    </w:p>
+    <w:p>
+      <w:pPr>
+        <w:pStyle w:val="ListBullet"/>
+      </w:pPr>
+      <w:r>
+        <w:t>Move the local LiteLLM cache to Redis and monitor deployment latency and failover events before multi-process production deployment.</w:t>
+      </w:r>
     </w:p>
     <w:p>
       <w:pPr>
@@ -4641,14 +4670,10 @@
             <w:shd w:fill="F2F4F7"/>
           </w:tcPr>
           <w:p>
-            <w:pPr>
-              <w:spacing w:after="40"/>
-            </w:pPr>
             <w:r>
               <w:rPr>
-                <w:b/>
-                <w:color w:val="0B2545"/>
-                <w:sz w:val="19"/>
+                <w:rFonts w:ascii="Arial" w:hAnsi="Arial"/>
+                <w:sz w:val="18"/>
               </w:rPr>
               <w:t>Path</w:t>
             </w:r>
@@ -4673,14 +4698,10 @@
             <w:shd w:fill="F2F4F7"/>
           </w:tcPr>
           <w:p>
-            <w:pPr>
-              <w:spacing w:after="40"/>
-            </w:pPr>
             <w:r>
               <w:rPr>
-                <w:b/>
-                <w:color w:val="0B2545"/>
-                <w:sz w:val="19"/>
+                <w:rFonts w:ascii="Arial" w:hAnsi="Arial"/>
+                <w:sz w:val="18"/>
               </w:rPr>
               <w:t>Role</w:t>
             </w:r>
@@ -4706,14 +4727,12 @@
             </w:tcMar>
           </w:tcPr>
           <w:p>
-            <w:pPr>
-              <w:spacing w:after="40"/>
-            </w:pPr>
             <w:r>
               <w:rPr>
-                <w:sz w:val="19"/>
+                <w:rFonts w:ascii="Arial" w:hAnsi="Arial"/>
+                <w:sz w:val="18"/>
               </w:rPr>
-              <w:t>code/config.py</w:t>
+              <w:t>scr_code/config.py</w:t>
             </w:r>
           </w:p>
         </w:tc>
@@ -4735,14 +4754,12 @@
             </w:tcMar>
           </w:tcPr>
           <w:p>
-            <w:pPr>
-              <w:spacing w:after="40"/>
-            </w:pPr>
             <w:r>
               <w:rPr>
-                <w:sz w:val="19"/>
+                <w:rFonts w:ascii="Arial" w:hAnsi="Arial"/>
+                <w:sz w:val="18"/>
               </w:rPr>
-              <w:t>Environment-backed settings and project root resolution.</w:t>
+              <w:t>Environment-backed settings, LangSmith tracing setup, and project root resolution.</w:t>
             </w:r>
           </w:p>
         </w:tc>
@@ -4766,14 +4783,12 @@
             </w:tcMar>
           </w:tcPr>
           <w:p>
-            <w:pPr>
-              <w:spacing w:after="40"/>
-            </w:pPr>
             <w:r>
               <w:rPr>
-                <w:sz w:val="19"/>
+                <w:rFonts w:ascii="Arial" w:hAnsi="Arial"/>
+                <w:sz w:val="18"/>
               </w:rPr>
-              <w:t>code/ingest.py</w:t>
+              <w:t>scr_code/ingest.py</w:t>
             </w:r>
           </w:p>
         </w:tc>
@@ -4795,14 +4810,12 @@
             </w:tcMar>
           </w:tcPr>
           <w:p>
-            <w:pPr>
-              <w:spacing w:after="40"/>
-            </w:pPr>
             <w:r>
               <w:rPr>
-                <w:sz w:val="19"/>
+                <w:rFonts w:ascii="Arial" w:hAnsi="Arial"/>
+                <w:sz w:val="18"/>
               </w:rPr>
-              <w:t>PDF/Excel loading, chunking, embedding, MongoDB upsert, vector index creation.</w:t>
+              <w:t>PDF and Excel loading, chunking, embedding, MongoDB upsert, and vector index creation.</w:t>
             </w:r>
           </w:p>
         </w:tc>
@@ -4826,14 +4839,12 @@
             </w:tcMar>
           </w:tcPr>
           <w:p>
-            <w:pPr>
-              <w:spacing w:after="40"/>
-            </w:pPr>
             <w:r>
               <w:rPr>
-                <w:sz w:val="19"/>
+                <w:rFonts w:ascii="Arial" w:hAnsi="Arial"/>
+                <w:sz w:val="18"/>
               </w:rPr>
-              <w:t>code/retrieve.py</w:t>
+              <w:t>scr_code/retrieve.py</w:t>
             </w:r>
           </w:p>
         </w:tc>
@@ -4855,12 +4866,10 @@
             </w:tcMar>
           </w:tcPr>
           <w:p>
-            <w:pPr>
-              <w:spacing w:after="40"/>
-            </w:pPr>
             <w:r>
               <w:rPr>
-                <w:sz w:val="19"/>
+                <w:rFonts w:ascii="Arial" w:hAnsi="Arial"/>
+                <w:sz w:val="18"/>
               </w:rPr>
               <w:t>MongoDB Atlas Vector Search retrieval for supplier context.</w:t>
             </w:r>
@@ -4886,14 +4895,12 @@
             </w:tcMar>
           </w:tcPr>
           <w:p>
-            <w:pPr>
-              <w:spacing w:after="40"/>
-            </w:pPr>
             <w:r>
               <w:rPr>
-                <w:sz w:val="19"/>
+                <w:rFonts w:ascii="Arial" w:hAnsi="Arial"/>
+                <w:sz w:val="18"/>
               </w:rPr>
-              <w:t>code/google_llm.py</w:t>
+              <w:t>scr_code/llm_gateway.py</w:t>
             </w:r>
           </w:p>
         </w:tc>
@@ -4915,14 +4922,12 @@
             </w:tcMar>
           </w:tcPr>
           <w:p>
-            <w:pPr>
-              <w:spacing w:after="40"/>
-            </w:pPr>
             <w:r>
               <w:rPr>
-                <w:sz w:val="19"/>
+                <w:rFonts w:ascii="Arial" w:hAnsi="Arial"/>
+                <w:sz w:val="18"/>
               </w:rPr>
-              <w:t>Gemini model factory.</w:t>
+              <w:t>LiteLLM model list, local cache, latency routing, failover, task classifier, and routed LangChain models.</w:t>
             </w:r>
           </w:p>
         </w:tc>
@@ -4946,14 +4951,12 @@
             </w:tcMar>
           </w:tcPr>
           <w:p>
-            <w:pPr>
-              <w:spacing w:after="40"/>
-            </w:pPr>
             <w:r>
               <w:rPr>
-                <w:sz w:val="19"/>
+                <w:rFonts w:ascii="Arial" w:hAnsi="Arial"/>
+                <w:sz w:val="18"/>
               </w:rPr>
-              <w:t>code/mysql_lookup.py</w:t>
+              <w:t>scr_code/mysql_lookup.py</w:t>
             </w:r>
           </w:p>
         </w:tc>
@@ -4975,14 +4978,12 @@
             </w:tcMar>
           </w:tcPr>
           <w:p>
-            <w:pPr>
-              <w:spacing w:after="40"/>
-            </w:pPr>
             <w:r>
               <w:rPr>
-                <w:sz w:val="19"/>
+                <w:rFonts w:ascii="Arial" w:hAnsi="Arial"/>
+                <w:sz w:val="18"/>
               </w:rPr>
-              <w:t>Read-only SQL generation and execution helper for PO and invoice tools.</w:t>
+              <w:t>Read-only SQL generation through the code model route and MySQL execution helper.</w:t>
             </w:r>
           </w:p>
         </w:tc>
@@ -5006,14 +5007,12 @@
             </w:tcMar>
           </w:tcPr>
           <w:p>
-            <w:pPr>
-              <w:spacing w:after="40"/>
-            </w:pPr>
             <w:r>
               <w:rPr>
-                <w:sz w:val="19"/>
+                <w:rFonts w:ascii="Arial" w:hAnsi="Arial"/>
+                <w:sz w:val="18"/>
               </w:rPr>
-              <w:t>code/procurement_graph.py</w:t>
+              <w:t>scr_code/procurement_graph.py</w:t>
             </w:r>
           </w:p>
         </w:tc>
@@ -5035,14 +5034,12 @@
             </w:tcMar>
           </w:tcPr>
           <w:p>
-            <w:pPr>
-              <w:spacing w:after="40"/>
-            </w:pPr>
             <w:r>
               <w:rPr>
-                <w:sz w:val="19"/>
+                <w:rFonts w:ascii="Arial" w:hAnsi="Arial"/>
+                <w:sz w:val="18"/>
               </w:rPr>
-              <w:t>LangGraph agent, custom state, tools, checkpointer, and CLI ask interface.</w:t>
+              <w:t>LangGraph agent, custom state, selected model route, tools, checkpointer, and CLI ask interface.</w:t>
             </w:r>
           </w:p>
         </w:tc>
@@ -5066,12 +5063,66 @@
             </w:tcMar>
           </w:tcPr>
           <w:p>
-            <w:pPr>
-              <w:spacing w:after="40"/>
-            </w:pPr>
             <w:r>
               <w:rPr>
-                <w:sz w:val="19"/>
+                <w:rFonts w:ascii="Arial" w:hAnsi="Arial"/>
+                <w:sz w:val="18"/>
+              </w:rPr>
+              <w:t>app.py</w:t>
+            </w:r>
+          </w:p>
+        </w:tc>
+        <w:tc>
+          <w:tcPr>
+            <w:tcW w:type="dxa" w:w="6480"/>
+            <w:vAlign w:val="center"/>
+            <w:tcBorders>
+              <w:top w:val="single" w:sz="6" w:space="0" w:color="D1D5DB"/>
+              <w:left w:val="single" w:sz="6" w:space="0" w:color="D1D5DB"/>
+              <w:bottom w:val="single" w:sz="6" w:space="0" w:color="D1D5DB"/>
+              <w:right w:val="single" w:sz="6" w:space="0" w:color="D1D5DB"/>
+            </w:tcBorders>
+            <w:tcMar>
+              <w:top w:w="80" w:type="dxa"/>
+              <w:start w:w="120" w:type="dxa"/>
+              <w:bottom w:w="80" w:type="dxa"/>
+              <w:end w:w="120" w:type="dxa"/>
+            </w:tcMar>
+          </w:tcPr>
+          <w:p>
+            <w:r>
+              <w:rPr>
+                <w:rFonts w:ascii="Arial" w:hAnsi="Arial"/>
+                <w:sz w:val="18"/>
+              </w:rPr>
+              <w:t>Streamlit chat interface that retains a generated thread_id for each browser session.</w:t>
+            </w:r>
+          </w:p>
+        </w:tc>
+      </w:tr>
+      <w:tr>
+        <w:tc>
+          <w:tcPr>
+            <w:tcW w:type="dxa" w:w="2880"/>
+            <w:vAlign w:val="center"/>
+            <w:tcBorders>
+              <w:top w:val="single" w:sz="6" w:space="0" w:color="D1D5DB"/>
+              <w:left w:val="single" w:sz="6" w:space="0" w:color="D1D5DB"/>
+              <w:bottom w:val="single" w:sz="6" w:space="0" w:color="D1D5DB"/>
+              <w:right w:val="single" w:sz="6" w:space="0" w:color="D1D5DB"/>
+            </w:tcBorders>
+            <w:tcMar>
+              <w:top w:w="80" w:type="dxa"/>
+              <w:start w:w="120" w:type="dxa"/>
+              <w:bottom w:w="80" w:type="dxa"/>
+              <w:end w:w="120" w:type="dxa"/>
+            </w:tcMar>
+          </w:tcPr>
+          <w:p>
+            <w:r>
+              <w:rPr>
+                <w:rFonts w:ascii="Arial" w:hAnsi="Arial"/>
+                <w:sz w:val="18"/>
               </w:rPr>
               <w:t>README.md</w:t>
             </w:r>
@@ -5095,14 +5146,12 @@
             </w:tcMar>
           </w:tcPr>
           <w:p>
-            <w:pPr>
-              <w:spacing w:after="40"/>
-            </w:pPr>
             <w:r>
               <w:rPr>
-                <w:sz w:val="19"/>
+                <w:rFonts w:ascii="Arial" w:hAnsi="Arial"/>
+                <w:sz w:val="18"/>
               </w:rPr>
-              <w:t>Current high-level instructions for agent tools and thread memory.</w:t>
+              <w:t>Runtime configuration and LiteLLM gateway setup instructions.</w:t>
             </w:r>
           </w:p>
         </w:tc>
@@ -5110,28 +5159,13 @@
       <w:tr>
         <w:tc>
           <w:tcPr>
-            <w:tcW w:type="dxa" w:w="2880"/>
-            <w:vAlign w:val="center"/>
-            <w:tcBorders>
-              <w:top w:val="single" w:sz="6" w:space="0" w:color="D1D5DB"/>
-              <w:left w:val="single" w:sz="6" w:space="0" w:color="D1D5DB"/>
-              <w:bottom w:val="single" w:sz="6" w:space="0" w:color="D1D5DB"/>
-              <w:right w:val="single" w:sz="6" w:space="0" w:color="D1D5DB"/>
-            </w:tcBorders>
-            <w:tcMar>
-              <w:top w:w="80" w:type="dxa"/>
-              <w:start w:w="120" w:type="dxa"/>
-              <w:bottom w:w="80" w:type="dxa"/>
-              <w:end w:w="120" w:type="dxa"/>
-            </w:tcMar>
+            <w:tcW w:type="dxa" w:w="4968"/>
           </w:tcPr>
           <w:p>
-            <w:pPr>
-              <w:spacing w:after="40"/>
-            </w:pPr>
             <w:r>
               <w:rPr>
-                <w:sz w:val="19"/>
+                <w:rFonts w:ascii="Arial" w:hAnsi="Arial"/>
+                <w:sz w:val="18"/>
               </w:rPr>
               <w:t>Procurement_RAG_Architecture.docx</w:t>
             </w:r>
@@ -5139,30 +5173,15 @@
         </w:tc>
         <w:tc>
           <w:tcPr>
-            <w:tcW w:type="dxa" w:w="6480"/>
-            <w:vAlign w:val="center"/>
-            <w:tcBorders>
-              <w:top w:val="single" w:sz="6" w:space="0" w:color="D1D5DB"/>
-              <w:left w:val="single" w:sz="6" w:space="0" w:color="D1D5DB"/>
-              <w:bottom w:val="single" w:sz="6" w:space="0" w:color="D1D5DB"/>
-              <w:right w:val="single" w:sz="6" w:space="0" w:color="D1D5DB"/>
-            </w:tcBorders>
-            <w:tcMar>
-              <w:top w:w="80" w:type="dxa"/>
-              <w:start w:w="120" w:type="dxa"/>
-              <w:bottom w:w="80" w:type="dxa"/>
-              <w:end w:w="120" w:type="dxa"/>
-            </w:tcMar>
+            <w:tcW w:type="dxa" w:w="4968"/>
           </w:tcPr>
           <w:p>
-            <w:pPr>
-              <w:spacing w:after="40"/>
-            </w:pPr>
             <w:r>
               <w:rPr>
-                <w:sz w:val="19"/>
+                <w:rFonts w:ascii="Arial" w:hAnsi="Arial"/>
+                <w:sz w:val="18"/>
               </w:rPr>
-              <w:t>This updated architecture reference document.</w:t>
+              <w:t>Current architecture reference document.</w:t>
             </w:r>
           </w:p>
         </w:tc>

</xml_diff>